<commit_message>
Reframe Med Supp concentration as an operating-performance risk
Section 10 rewrite. The prior "hits earnings, franchise, and capital at
once" framing overstated the business-profile channel: AM Best's franchise
grade is driven by scale, market position, and product breadth, and pure
geographic concentration rarely lowers a diversified carrier's grade (HCSC
in a few states is Favorable; Pekin, multi-line and Illinois-concentrated,
holds Neutral like us). Recast concentration as an earnings risk that
amplifies the one block already in play, with Pekin's weather-concentration
Negative outlook as the real-world template. Rebuilt the figure as the
earnings-channel chain. Summary updated to match.

Co-Authored-By: Claude Opus 4.8 <noreply@anthropic.com>
Claude-Session: https://claude.ai/code/session_01YRueGHXtRVcegcpASvBSya
</commit_message>
<xml_diff>
--- a/output/whitepaper/Wellabe_AMBest_Rating.docx
+++ b/output/whitepaper/Wellabe_AMBest_Rating.docx
@@ -4336,7 +4336,7 @@
           <w:color w:val="2E5A88"/>
           <w:sz w:val="27"/>
         </w:rPr>
-        <w:t>10.  Medicare Supplement concentration, the stress that hits everything at once</w:t>
+        <w:t>10.  Medicare Supplement concentration, an earnings risk more than a franchise one</w:t>
       </w:r>
     </w:p>
     <w:p>
@@ -4347,7 +4347,29 @@
         <w:rPr>
           <w:sz w:val="21"/>
         </w:rPr>
-        <w:t>There is one scenario that does not respect the neat one-lever-at-a-time logic, and it deserves its own place. Medicare Supplement is our largest line, and our sales are concentrated in our top states. A shock to that line, whether a regulatory change, a wave of rate pressure, or a competitive move, would not land in one place. It would push on our earnings, because loss ratios would rise and the turn would be delayed. It would push on our franchise, because our most concentrated line is the one under pressure. And it would push on our capital, because weaker earnings draw down surplus faster. This is the event that can move several blocks at the same time, which is why it is the concentration we watch most closely even though the franchise grade is otherwise stable.</w:t>
+        <w:t>Medicare Supplement is our largest line, and our sales are concentrated in our top states. The natural worry is that this concentration threatens our franchise grade. It is worth being precise about how it would actually hurt us, because the intuition points at the wrong block.</w:t>
+      </w:r>
+    </w:p>
+    <w:p>
+      <w:pPr>
+        <w:spacing w:after="120"/>
+      </w:pPr>
+      <w:r>
+        <w:rPr>
+          <w:sz w:val="21"/>
+        </w:rPr>
+        <w:t>AM Best's business-profile grade is driven mostly by scale, market position, and product breadth, and pure geographic concentration rarely lowers a diversified carrier's grade on its own. The peers prove it. HCSC writes Medicare Supplement in only a handful of states and is assessed Favorable, carried by the scale of its overall health franchise. Pekin Life is a close match to us, multi-line with Medicare Supplement in its book and operating in 22 states but heavily concentrated in Illinois, and it holds Neutral, the same grade we do. Our own franchise is broader than either the small specialists or a single-state carrier, with multiple senior-market lines, more than 40 states, and several distribution channels. State concentration in one line is unlikely to move that grade.</w:t>
+      </w:r>
+    </w:p>
+    <w:p>
+      <w:pPr>
+        <w:spacing w:after="120"/>
+      </w:pPr>
+      <w:r>
+        <w:rPr>
+          <w:sz w:val="21"/>
+        </w:rPr>
+        <w:t>Where the concentration would bite is earnings. A regulatory change, a wave of rate pressure, or a competitive move aimed at our top Medicare Supplement states would raise loss ratios and delay or reverse the very turn the whole rating depends on. That lands on operating performance, the block that is already most in play and the one that realistically moves us. The concentration is dangerous because it makes an earnings slip both more likely and deeper, not because it lowers our franchise grade. And if that earnings slip arrives near the capital trough, it is exactly the both-levers case from the previous section.</w:t>
       </w:r>
     </w:p>
     <w:p>
@@ -4357,7 +4379,7 @@
       <w:r>
         <w:drawing>
           <wp:inline xmlns:a="http://schemas.openxmlformats.org/drawingml/2006/main" xmlns:pic="http://schemas.openxmlformats.org/drawingml/2006/picture">
-            <wp:extent cx="5577840" cy="2549870"/>
+            <wp:extent cx="5577840" cy="1792877"/>
             <wp:docPr id="6" name="Picture 6"/>
             <wp:cNvGraphicFramePr>
               <a:graphicFrameLocks noChangeAspect="1"/>
@@ -4378,7 +4400,7 @@
                   <pic:spPr>
                     <a:xfrm>
                       <a:off x="0" y="0"/>
-                      <a:ext cx="5577840" cy="2549870"/>
+                      <a:ext cx="5577840" cy="1792877"/>
                     </a:xfrm>
                     <a:prstGeom prst="rect"/>
                   </pic:spPr>
@@ -4400,7 +4422,18 @@
           <w:color w:val="5C6B78"/>
           <w:sz w:val="18"/>
         </w:rPr>
-        <w:t>Figure 6. A single Medicare Supplement shock pushes on earnings, franchise, and capital together, which is how a one-letter risk becomes a two-letter one.</w:t>
+        <w:t>Figure 6. Med Supp concentration would move us through earnings, the block already in play, rather than through the franchise grade.</w:t>
+      </w:r>
+    </w:p>
+    <w:p>
+      <w:pPr>
+        <w:spacing w:after="120"/>
+      </w:pPr>
+      <w:r>
+        <w:rPr>
+          <w:sz w:val="21"/>
+        </w:rPr>
+        <w:t>Pekin is the real-world template, through the right channel. Its concentration risk is property catastrophe in the Midwest, a different peril, but the shape is identical: a concentrated book, a shock in the form of severe storms, and the result was a move to a Negative outlook in 2024 driven by earnings pressure, since restored to Stable. The geographic concentration acted through earnings and the outlook, not through a franchise downgrade. For us the concentrated book is Medicare Supplement and the shock would be regulatory, rate, or competitive, but the mechanism is the same, which is why we watch this as an operating-performance risk.</w:t>
       </w:r>
     </w:p>
     <w:p>
@@ -4492,7 +4525,7 @@
         <w:rPr>
           <w:sz w:val="21"/>
         </w:rPr>
-        <w:t>Two levers can move us, and each on its own costs one letter, to A-. A capital slip takes us to A-, and a Strong balance sheet at A- is survivable, as Globe Life and American Southern show. An earnings slip takes us to A- as well, and that move comes with warning and is reversible. The case that takes us to B++ is both levers slipping together, and the reason it is worth real attention is timing, because the plan stresses capital and earnings in the same two years, with earnings already at the bottom of Adequate. A Medicare Supplement shock is the one event that could push capital, earnings, and franchise at once, so it is the concentration we watch most. The things in our control are the combined-ratio turn, the BCAR trajectory, disciplined capital actions, and reading the outlook as the early signal it is.</w:t>
+        <w:t>Two levers can move us, and each on its own costs one letter, to A-. A capital slip takes us to A-, and a Strong balance sheet at A- is survivable, as Globe Life and American Southern show. An earnings slip takes us to A- as well, and that move comes with warning and is reversible. The case that takes us to B++ is both levers slipping together, and the reason it is worth real attention is timing, because the plan stresses capital and earnings in the same two years, with earnings already at the bottom of Adequate. Our Medicare Supplement state concentration is best understood as part of that earnings risk. It would not lower our franchise grade, but it makes an earnings slip more likely and deeper, which is the slip that costs us a letter and, near the capital trough, the one that could reach B++. The things in our control are the combined-ratio turn, the BCAR trajectory, disciplined capital actions, and reading the outlook as the early signal it is.</w:t>
       </w:r>
     </w:p>
     <w:p>

</xml_diff>

<commit_message>
Remove section 2 from paper; add standalone rating-move case studies
Backs the weak channel-commentary section out of the main paper (restored to
12 sections). Adds a separate companion note, Rating_Move_Case_Studies.docx,
built from real research: Phoenix (A- to B++, 2009) losing its largest
distributor and collapsing sales; F&G (A- to A, 2024) widening distribution;
American Southern (A to A-, 2026) as the within-band warning shot; and the
hard-to-cross-back-above-A- lesson. Documents the asymmetry: the business
impact is a cliff at the A- line, not linear per notch.

Co-Authored-By: Claude Opus 4.8 <noreply@anthropic.com>
Claude-Session: https://claude.ai/code/session_01YRueGHXtRVcegcpASvBSya
</commit_message>
<xml_diff>
--- a/output/whitepaper/Wellabe_AMBest_Rating.docx
+++ b/output/whitepaper/Wellabe_AMBest_Rating.docx
@@ -102,7 +102,7 @@
         <w:rPr>
           <w:sz w:val="21"/>
         </w:rPr>
-        <w:t>Because of that, the rating matters most where our distribution is rating-sensitive: preneed, reinsurance, and raising capital, including the surplus note we are working toward. In our agent Medicare Supplement and supplemental-health channels it matters much less, because the product is standardized and guaranty-backed, so agents place business on price, commission, and service more than on the letter. The next section puts real examples behind that.</w:t>
+        <w:t>Because of that, the rating matters most where our distribution is rating-sensitive: preneed, reinsurance, and raising capital, including the surplus note we are working toward. In our agent Medicare Supplement and supplemental-health channels it matters much less, because the product is standardized and guaranty-backed, so agents place business on price, commission, and service more than on the letter.</w:t>
       </w:r>
     </w:p>
     <w:p>
@@ -115,75 +115,7 @@
           <w:color w:val="2E5A88"/>
           <w:sz w:val="27"/>
         </w:rPr>
-        <w:t>2.  What a rating change actually does to the business</w:t>
-      </w:r>
-    </w:p>
-    <w:p>
-      <w:pPr>
-        <w:spacing w:after="120"/>
-      </w:pPr>
-      <w:r>
-        <w:rPr>
-          <w:sz w:val="21"/>
-        </w:rPr>
-        <w:t>Before the mechanics, it helps to know what a notch is worth in the real world, because the answer is not the same for every carrier. The impact of a move depends almost entirely on how rating-sensitive your distribution is. In advisor-sold annuities, bank and broker-dealer channels, and institutional and reinsurance relationships, the letter is close to a gate. In guaranty-backed, agent-sold Medicare Supplement, it is much closer to a formality.</w:t>
-      </w:r>
-    </w:p>
-    <w:p>
-      <w:pPr>
-        <w:spacing w:after="120"/>
-      </w:pPr>
-      <w:r>
-        <w:rPr>
-          <w:sz w:val="21"/>
-        </w:rPr>
-        <w:t>The clearest cautionary case is Genworth. A little over a decade ago it carried A-range ratings. A series of downgrades tied to long-term care losses pushed its main life carriers down to the B and C++ range. In its own public filings Genworth spelled out the mechanism: a downgrade could reduce new sales, damage relationships with the intermediaries who actually place the business, and increase policy surrenders and withdrawals. In the end it stopped selling long-term care and life through those companies and put the block into runoff. That is the full chain, from a lower letter to lost distribution to weaker persistency, in one company.</w:t>
-      </w:r>
-    </w:p>
-    <w:p>
-      <w:pPr>
-        <w:spacing w:after="120"/>
-      </w:pPr>
-      <w:r>
-        <w:rPr>
-          <w:sz w:val="21"/>
-        </w:rPr>
-        <w:t>The A- line is the one that matters most, and it is largely a distribution rule rather than a solvency one. In advisor and annuity channels the common guidance is to place business only with carriers rated A- or better, so a drop below A- quietly removes a carrier from many shelves even though it can still pay every claim. That is why we treat A- as the line to defend.</w:t>
-      </w:r>
-    </w:p>
-    <w:p>
-      <w:pPr>
-        <w:spacing w:after="120"/>
-      </w:pPr>
-      <w:r>
-        <w:rPr>
-          <w:sz w:val="21"/>
-        </w:rPr>
-        <w:t>For our channels specifically, the impact is more muted, and the peers show it. ManhattanLife sells Medicare Supplement and supplemental health in the same independent-agent channels we use at a B++ rating, and its Western United arm does so at B+. Both compete actively below A-, because in guaranty-backed senior health the agent places business on price, commission, underwriting speed, and service more than on the letter. So an A- outcome for us would be uncomfortable but not damaging across most of our book. Where a drop below A- would actually cost us is narrower and real: preneed, where funeral-home programs prefer strong, stable carriers for decades-long obligations; reinsurance, where counterparties price our rating into terms; and capital raising, including the surplus note. Upgrades work in reverse but more gently. They mostly restore shelf access and give the marketing and reinsurance teams a better number to lead with, rather than producing a sales jump on their own.</w:t>
-      </w:r>
-    </w:p>
-    <w:p>
-      <w:pPr>
-        <w:spacing w:after="120"/>
-      </w:pPr>
-      <w:r>
-        <w:rPr>
-          <w:sz w:val="21"/>
-        </w:rPr>
-        <w:t>One honest limit. Carriers rarely publish clean figures tying a single notch to sales, net promoter scores, or persistency, so most of this is directional rather than precise. The documented effects are on new-business and distribution access, and, at severe multi-notch downgrades, on surrenders. The takeaway for us is calibration, not alarm: an A- would be manageable in our channels, and the real damage begins below A-, concentrated in preneed, reinsurance, and capital raising.</w:t>
-      </w:r>
-    </w:p>
-    <w:p>
-      <w:pPr>
-        <w:spacing w:before="240" w:after="40"/>
-      </w:pPr>
-      <w:r>
-        <w:rPr>
-          <w:b/>
-          <w:color w:val="2E5A88"/>
-          <w:sz w:val="27"/>
-        </w:rPr>
-        <w:t>3.  How AM Best builds the letter</w:t>
+        <w:t>2.  How AM Best builds the letter</w:t>
       </w:r>
     </w:p>
     <w:p>
@@ -699,7 +631,7 @@
           <w:color w:val="2E5A88"/>
           <w:sz w:val="27"/>
         </w:rPr>
-        <w:t>4.  The two capital yardsticks: RBC and BCAR</w:t>
+        <w:t>3.  The two capital yardsticks: RBC and BCAR</w:t>
       </w:r>
     </w:p>
     <w:p>
@@ -1016,7 +948,7 @@
           <w:color w:val="2E5A88"/>
           <w:sz w:val="27"/>
         </w:rPr>
-        <w:t>5.  Our rating today, and how we got to A</w:t>
+        <w:t>4.  Our rating today, and how we got to A</w:t>
       </w:r>
     </w:p>
     <w:p>
@@ -1540,7 +1472,7 @@
           <w:color w:val="2E5A88"/>
           <w:sz w:val="27"/>
         </w:rPr>
-        <w:t>6.  Our capital, and where the plan takes it</w:t>
+        <w:t>5.  Our capital, and where the plan takes it</w:t>
       </w:r>
     </w:p>
     <w:p>
@@ -1703,7 +1635,7 @@
           <w:color w:val="2E5A88"/>
           <w:sz w:val="27"/>
         </w:rPr>
-        <w:t>7.  How we compare to peers</w:t>
+        <w:t>6.  How we compare to peers</w:t>
       </w:r>
     </w:p>
     <w:p>
@@ -4290,7 +4222,7 @@
           <w:color w:val="2E5A88"/>
           <w:sz w:val="27"/>
         </w:rPr>
-        <w:t>8.  Lever one: the balance sheet</w:t>
+        <w:t>7.  Lever one: the balance sheet</w:t>
       </w:r>
     </w:p>
     <w:p>
@@ -4325,7 +4257,7 @@
           <w:color w:val="2E5A88"/>
           <w:sz w:val="27"/>
         </w:rPr>
-        <w:t>9.  Lever two: operating performance</w:t>
+        <w:t>8.  Lever two: operating performance</w:t>
       </w:r>
     </w:p>
     <w:p>
@@ -4424,7 +4356,7 @@
           <w:color w:val="2E5A88"/>
           <w:sz w:val="27"/>
         </w:rPr>
-        <w:t>10.  Lever three: business profile</w:t>
+        <w:t>9.  Lever three: business profile</w:t>
       </w:r>
     </w:p>
     <w:p>
@@ -4523,7 +4455,7 @@
           <w:color w:val="2E5A88"/>
           <w:sz w:val="27"/>
         </w:rPr>
-        <w:t>11.  Lever four: risk management</w:t>
+        <w:t>10.  Lever four: risk management</w:t>
       </w:r>
     </w:p>
     <w:p>
@@ -4558,7 +4490,7 @@
           <w:color w:val="2E5A88"/>
           <w:sz w:val="27"/>
         </w:rPr>
-        <w:t>12.  The two levers that move us, together</w:t>
+        <w:t>11.  The two levers that move us, together</w:t>
       </w:r>
     </w:p>
     <w:p>
@@ -4893,7 +4825,7 @@
           <w:color w:val="2E5A88"/>
           <w:sz w:val="27"/>
         </w:rPr>
-        <w:t>13.  What we watch, and what is in our control</w:t>
+        <w:t>12.  What we watch, and what is in our control</w:t>
       </w:r>
     </w:p>
     <w:p>

</xml_diff>

<commit_message>
Publish the corrected assessments to the site as well as BCAR
The patch path only refreshed bcar_score, so the six seed corrections taken
from the credit reports never reached tool/public_data.json and the site was
still showing the superseded grades for Globe Life, both ManhattanLife units,
Reserve National and Funeral Directors. Refresh the AM Best label fields from
assessments.csv on the same pass.

Co-Authored-By: Claude Opus 4.8 <noreply@anthropic.com>
Claude-Session: https://claude.ai/code/session_01YRueGHXtRVcegcpASvBSya
</commit_message>
<xml_diff>
--- a/output/whitepaper/Wellabe_AMBest_Rating.docx
+++ b/output/whitepaper/Wellabe_AMBest_Rating.docx
@@ -787,7 +787,7 @@
         <w:rPr>
           <w:sz w:val="21"/>
         </w:rPr>
-        <w:t>BCAR is the largest input to that grade, and across the peer set the median score steps down cleanly with each tier: about 66% for Strongest, 31% for Very Strong, 11% for Strong and 8% for Adequate. The tiers overlap at the edges, so the score indicates the grade without determining it.</w:t>
+        <w:t>BCAR is the largest input to that grade, and across the peer set the median score steps down cleanly with each tier: about 64% for Strongest, 31% for Very Strong, 11% for Strong and 8% for Adequate. The tiers overlap at the edges, so the score indicates the grade without determining it.</w:t>
       </w:r>
     </w:p>
     <w:p>
@@ -3030,7 +3030,7 @@
               <w:rPr>
                 <w:sz w:val="18"/>
               </w:rPr>
-              <w:t>Strong</w:t>
+              <w:t>Very Strong</w:t>
             </w:r>
           </w:p>
         </w:tc>
@@ -3614,7 +3614,7 @@
               <w:rPr>
                 <w:sz w:val="18"/>
               </w:rPr>
-              <w:t>Limited</w:t>
+              <w:t>Neutral</w:t>
             </w:r>
           </w:p>
         </w:tc>
@@ -3942,7 +3942,7 @@
               <w:rPr>
                 <w:sz w:val="18"/>
               </w:rPr>
-              <w:t>Strong</w:t>
+              <w:t>Adequate</w:t>
             </w:r>
           </w:p>
         </w:tc>
@@ -4284,7 +4284,7 @@
               <w:rPr>
                 <w:sz w:val="18"/>
               </w:rPr>
-              <w:t>Strong</w:t>
+              <w:t>Adequate</w:t>
             </w:r>
           </w:p>
         </w:tc>

</xml_diff>

<commit_message>
Integrate the recovery path into section 9 instead of appending it
The recovery argument was added last turn but bolted onto a section that had
already concluded the opposite. Section 9 asserted that carriers falling below
A- "rarely climb back without new capital" and then, two paragraphs later, that
recovery to A- is the realistic outcome. It also closed twice, with the
probability sentence stranded mid-section.

Reordered so the section makes one argument: the scenario, what B++ costs, the
recovery to A-, the two conditions that gate it (time at B++, and distribution
while we are there), then the probability assessment as the closer. The
distribution-loss mechanism is kept, but as the condition on recovery rather
than as a claim that recovery does not happen. The summary carried the same
gap and now reflects the trough-and-recovery shape.

Co-Authored-By: Claude Opus 4.8 <noreply@anthropic.com>
Claude-Session: https://claude.ai/code/session_01YRueGHXtRVcegcpASvBSya
</commit_message>
<xml_diff>
--- a/output/whitepaper/Wellabe_AMBest_Rating.docx
+++ b/output/whitepaper/Wellabe_AMBest_Rating.docx
@@ -4800,7 +4800,7 @@
         <w:rPr>
           <w:sz w:val="21"/>
         </w:rPr>
-        <w:t>At B++ the damage is concentrated where the rating actually sells. Preneed programs and funeral-home relationships come under immediate pressure, reinsurance terms tighten, and any capital raise gets materially more expensive. Guaranty-backed agent Medicare Supplement is the most insulated. The recovery problem is the harder part: carriers that fall below A- rarely climb back without new capital, because the distribution loss removes the earnings that would justify an upgrade.</w:t>
+        <w:t>At B++ the damage is concentrated where the rating actually sells. Preneed programs and funeral-home relationships come under immediate pressure, reinsurance terms tighten, and any capital raise gets materially more expensive. Guaranty-backed agent Medicare Supplement is the most insulated.</w:t>
       </w:r>
     </w:p>
     <w:p>
@@ -4811,7 +4811,7 @@
         <w:rPr>
           <w:sz w:val="21"/>
         </w:rPr>
-        <w:t>We assess this as a low-probability path. It requires both blocks to fail together rather than either one alone, and we would have warning before it arrived.</w:t>
+        <w:t>What happens next matters more than the drop itself, because B++ is a trough rather than a resting place. The operating slip that takes us there is a move from Adequate to Marginal, and Marginal means Best has stopped believing the losses turn. If profitability arrives shortly after, which is what the plan and the current combined-ratio trend both point to, that block returns to Adequate. Adequate is the no-change state, so recovering it does not require us to earn a positive notch. It only requires us to stop losing one. On a Very Strong balance sheet that puts us back at a- and A-, inside the appetite, and if capital rebuilds past the trough as planned the starting point returns to a and the letter to A.</w:t>
       </w:r>
     </w:p>
     <w:p>
@@ -4822,7 +4822,7 @@
         <w:rPr>
           <w:sz w:val="21"/>
         </w:rPr>
-        <w:t>The more useful point is what happens next, because B++ is a trough rather than a resting place. The operating slip that takes us there is a move from Adequate to Marginal, and Marginal means Best has stopped believing the losses turn. If profitability arrives shortly after, which is what the plan and the current combined-ratio trend both point to, that block returns to Adequate. Adequate is the no-change state, so recovering it does not require us to earn a positive notch. It only requires us to stop losing one. On a Very Strong balance sheet that puts us back at a- and A-, inside the appetite, and if capital rebuilds past the trough as planned the starting point returns to a and the letter to A.</w:t>
+        <w:t>The realistic shape of the downside is therefore a dip to B++ followed by a recovery to A-, rather than a permanent reset. Two things decide whether it plays out that way. The first is how long we sit at B++, because Best upgrades on demonstrated results rather than forecasts, so the recovery lags the earnings by at least a review cycle. The second is what happens to distribution while we are there. Carriers that fall below A- and lose shelf access can find the earnings recovery undercut by the business they lost, and that is the mechanism that keeps some of them down. Our exposure to it runs through preneed and reinsurance rather than through guaranty-backed Medicare Supplement, so holding those relationships through the trough is what converts a dip into a full recovery.</w:t>
       </w:r>
     </w:p>
     <w:p>
@@ -4833,7 +4833,7 @@
         <w:rPr>
           <w:sz w:val="21"/>
         </w:rPr>
-        <w:t>So the realistic shape of the downside is a dip to B++ followed by a recovery to A-, not a permanent reset. Two things determine whether it plays out that way. The first is time at B++, because Best upgrades on demonstrated results rather than forecasts, so the recovery lags the earnings by at least a review cycle. The second is what happens to distribution while we sit there. Carriers that fall below A- and lose shelf access can find the earnings recovery undercut by the business they lost, which is the mechanism that keeps some of them down. Our exposure to that runs through preneed and reinsurance rather than through guaranty-backed Medicare Supplement. Holding those relationships through the trough is what converts a two-year dip into a full recovery.</w:t>
+        <w:t>We assess the two-block scenario as a low-probability path. It requires both blocks to fail together rather than either one alone, we would have warning before it arrived, and the recovery route back to A- is open provided distribution holds.</w:t>
       </w:r>
     </w:p>
     <w:p>
@@ -4947,7 +4947,7 @@
         <w:rPr>
           <w:sz w:val="21"/>
         </w:rPr>
-        <w:t>Two blocks can realistically move us. Each on its own costs one letter and lands us at A-, still inside the appetite. Both together cost two and take us to B++, outside it. The base case is that we hold A, and the first half of 2026 supports it. The exposure is that both live blocks are stressed in the same window, so the discipline is to keep the capital path explained in advance and the operating evidence arriving on time.</w:t>
+        <w:t>Two blocks can realistically move us. Each on its own costs one letter and lands us at A-, still inside the appetite. Both together cost two and take us to B++, outside it, though that case is a trough rather than an end state: returning operating performance to Adequate brings us back to A-, and it requires only that we stop losing a notch rather than earn one. The base case is that we hold A, and the first half of 2026 supports it. The exposure is that both live blocks are stressed in the same window, so the discipline is to keep the capital path explained in advance, the operating evidence arriving on time, and the preneed and reinsurance relationships intact through the trough.</w:t>
       </w:r>
     </w:p>
     <w:p>

</xml_diff>